<commit_message>
Got inverter and charger control working from Cerbo GUI
Finally got feedback from Xantrex Tech support on how to control the inverter/charger operation using the NMEA packets.  Also rearranged the transmit packet definitions and put them in the Xantrex class where they should be.
</commit_message>
<xml_diff>
--- a/Changing Freedom XC Pro Marine settings via NMEA2000.docx
+++ b/Changing Freedom XC Pro Marine settings via NMEA2000.docx
@@ -9,21 +9,35 @@
       </w:pPr>
       <w:r>
         <w:rPr/>
-        <w:t xml:space="preserve">Changing FXC  Pro settings over NMEA2000 </w:t>
-      </w:r>
-    </w:p>
-    <w:p>
-      <w:pPr>
-        <w:pStyle w:val="Normal"/>
-        <w:rPr/>
-      </w:pPr>
-      <w:r>
-        <w:rPr/>
-      </w:r>
-    </w:p>
-    <w:p>
-      <w:pPr>
-        <w:pStyle w:val="Normal"/>
+        <w:t xml:space="preserve">Changing FXC Pro Marine Settings over NMEA2000 </w:t>
+      </w:r>
+    </w:p>
+    <w:p>
+      <w:pPr>
+        <w:pStyle w:val="Normal"/>
+        <w:rPr/>
+      </w:pPr>
+      <w:r>
+        <w:rPr/>
+      </w:r>
+    </w:p>
+    <w:p>
+      <w:pPr>
+        <w:pStyle w:val="Normal"/>
+        <w:rPr/>
+      </w:pPr>
+      <w:r>
+        <w:rPr/>
+        <w:t>Important considerations:</w:t>
+      </w:r>
+    </w:p>
+    <w:p>
+      <w:pPr>
+        <w:pStyle w:val="ListParagraph"/>
+        <w:numPr>
+          <w:ilvl w:val="0"/>
+          <w:numId w:val="1"/>
+        </w:numPr>
         <w:rPr/>
       </w:pPr>
       <w:r>
@@ -33,7 +47,50 @@
     </w:p>
     <w:p>
       <w:pPr>
-        <w:pStyle w:val="Normal"/>
+        <w:pStyle w:val="ListParagraph"/>
+        <w:numPr>
+          <w:ilvl w:val="0"/>
+          <w:numId w:val="1"/>
+        </w:numPr>
+        <w:rPr/>
+      </w:pPr>
+      <w:r>
+        <w:rPr/>
+        <w:t xml:space="preserve">The examples mentioned in this document are assuming default values for the AC Input Instance, DC Instance, AC Out Instance, and Inverter Charger Instance. </w:t>
+      </w:r>
+      <w:r>
+        <w:rPr>
+          <w:b/>
+          <w:bCs/>
+        </w:rPr>
+        <w:t>ONLY If you customize those parameters</w:t>
+      </w:r>
+      <w:r>
+        <w:rPr/>
+        <w:t xml:space="preserve">, then you will need to replace the Instance values used in the examples with the custom instance values. </w:t>
+      </w:r>
+    </w:p>
+    <w:p>
+      <w:pPr>
+        <w:pStyle w:val="ListParagraph"/>
+        <w:numPr>
+          <w:ilvl w:val="0"/>
+          <w:numId w:val="1"/>
+        </w:numPr>
+        <w:rPr/>
+      </w:pPr>
+      <w:r>
+        <w:rPr/>
+        <w:t>If you want to see the instance values, then insert a blank USB into the FXC Pro, and wait 30 seconds. Then take the USB out, plug into your computer, and there should be a folder created. Inside the folder, will be a file called “fxcc_user_cfg.yaml”. This file will list all the Instance associations at the top.</w:t>
+      </w:r>
+    </w:p>
+    <w:p>
+      <w:pPr>
+        <w:pStyle w:val="ListParagraph"/>
+        <w:numPr>
+          <w:ilvl w:val="0"/>
+          <w:numId w:val="1"/>
+        </w:numPr>
         <w:rPr/>
       </w:pPr>
       <w:r>
@@ -67,19 +124,646 @@
     <w:p>
       <w:pPr>
         <w:pStyle w:val="Heading2"/>
+        <w:rPr/>
+      </w:pPr>
+      <w:r>
+        <w:rPr/>
+        <w:t>PGN 130913 ( PM – AC Input Configuration Status )</w:t>
+      </w:r>
+    </w:p>
+    <w:p>
+      <w:pPr>
+        <w:pStyle w:val="Normal"/>
+        <w:rPr/>
+      </w:pPr>
+      <w:r>
+        <w:rPr/>
+        <w:t>To configure the Breaker Size &amp; AC Lost Level, the following data format is used:</w:t>
+      </w:r>
+    </w:p>
+    <w:p>
+      <w:pPr>
+        <w:pStyle w:val="Normal"/>
+        <w:rPr/>
+      </w:pPr>
+      <w:r>
+        <w:rPr/>
+        <w:t>Data: 01 61 FF 01 F8 04 01 A8 00 03 04 08 XX XX 09 XX XX</w:t>
+      </w:r>
+    </w:p>
+    <w:p>
+      <w:pPr>
+        <w:pStyle w:val="Normal"/>
+        <w:rPr/>
+      </w:pPr>
+      <w:r>
+        <w:rPr/>
+        <w:t>01 = Command Message</w:t>
+        <w:br/>
+        <w:t>61FF01 = PGN ( 01FF61 = 130913 )</w:t>
+        <w:br/>
+        <w:t xml:space="preserve">F8 = Priority ( 8 ) </w:t>
+        <w:br/>
+        <w:t>04 = Number of Pairs of Commanded Parameters To Follow ( 4 )</w:t>
+        <w:br/>
+        <w:t>01 = Field Num of First Param ( Manufacturer Code )</w:t>
+        <w:br/>
+        <w:t>A8 00 = Value of First Param ( 168 decimal, A8 in hex, but the field is 11 bits long, so the value is 00A8h )</w:t>
+        <w:br/>
+        <w:t>03 = Field Num of Second Param ( Industry Group )</w:t>
+        <w:br/>
+        <w:t>04 = Value of Second Param ( 04 = "Marine" )</w:t>
+        <w:br/>
+        <w:t>08 = Field Num of Third Param ( Breaker Size )</w:t>
+        <w:br/>
+        <w:t>XX XX = Value of Third Param ( Scale = 0.1, decoded value must be within 5A – 50A )</w:t>
+        <w:br/>
+        <w:t>09 = Field Num of Fourth Param ( AC Lost Lvl )</w:t>
+        <w:br/>
+        <w:t>XX XX = Value of Fourth Param ( Scale = 0.01, decoded value must be within 85V – 110V )</w:t>
+      </w:r>
+    </w:p>
+    <w:p>
+      <w:pPr>
+        <w:pStyle w:val="Normal"/>
+        <w:rPr/>
+      </w:pPr>
+      <w:r>
+        <w:rPr/>
+      </w:r>
+    </w:p>
+    <w:p>
+      <w:pPr>
+        <w:pStyle w:val="Normal"/>
+        <w:rPr/>
+      </w:pPr>
+      <w:r>
         <w:rPr>
-          <w:b/>
-          <w:bCs/>
-          <w:color w:val="auto"/>
+          <w:rStyle w:val="SubtleEmphasis"/>
         </w:rPr>
-      </w:pPr>
-      <w:r>
+        <w:t>EXAMPLE:</w:t>
+      </w:r>
+      <w:r>
+        <w:rPr/>
+        <w:br/>
+        <w:t>Let’s say we want to set the AC Breaker size to 30A, and set the AcLostLvl to 104V.</w:t>
+      </w:r>
+    </w:p>
+    <w:p>
+      <w:pPr>
+        <w:pStyle w:val="Normal"/>
         <w:rPr>
-          <w:b/>
-          <w:bCs/>
-          <w:color w:val="auto"/>
+          <w:i/>
+          <w:iCs/>
+          <w:color w:themeColor="text1" w:themeTint="bf" w:val="404040"/>
         </w:rPr>
-        <w:t>PGN 65281 ( FXCC Configuration Status )</w:t>
+      </w:pPr>
+      <w:r>
+        <w:rPr/>
+        <w:t>Data: 01 61 FF 01 F8 04 01 A8 00 03 04 08 2C 01 09 A0 28</w:t>
+      </w:r>
+    </w:p>
+    <w:p>
+      <w:pPr>
+        <w:pStyle w:val="Normal"/>
+        <w:rPr/>
+      </w:pPr>
+      <w:r>
+        <w:rPr/>
+        <w:t>01 = Command Message</w:t>
+        <w:br/>
+        <w:t>61FF01 = PGN ( 01FF61 )</w:t>
+        <w:br/>
+        <w:t xml:space="preserve">F8 = Priority ( 8 ) </w:t>
+        <w:br/>
+        <w:t>04 = Number of Pairs of Commanded Parameters To Follow ( 4 )</w:t>
+        <w:br/>
+        <w:t>01 = Field Num of First Param ( Manufacturer Code )</w:t>
+        <w:br/>
+        <w:t>A8 00 = Value of First Param ( 168 decimal, A8 in hex, but the field is 11 bits long, so the value is 00A8h )</w:t>
+        <w:br/>
+        <w:t>03 = Field Num of Second Param ( Industry Group )</w:t>
+        <w:br/>
+        <w:t>04 = Value of Second Param ( 04 = "Marine" )</w:t>
+        <w:br/>
+        <w:t>08 = Field Num of Third Param ( Breaker Size )</w:t>
+        <w:br/>
+        <w:t>2C 01 = Value of Third Param ( Let’s say we want 30A, then 30A / 0.1 = 300. 300 in hex is 012C )</w:t>
+        <w:br/>
+        <w:t>09 = Field Num of Fourth Param ( AC Lost Lvl )</w:t>
+        <w:br/>
+        <w:t>A0 28 = Value of Fourth Param ( 104 / 0.01 = 10,400 = 28A0h )</w:t>
+      </w:r>
+    </w:p>
+    <w:p>
+      <w:pPr>
+        <w:pStyle w:val="Normal"/>
+        <w:rPr/>
+      </w:pPr>
+      <w:r>
+        <w:rPr/>
+      </w:r>
+    </w:p>
+    <w:p>
+      <w:pPr>
+        <w:pStyle w:val="Normal"/>
+        <w:keepNext w:val="true"/>
+        <w:rPr/>
+      </w:pPr>
+      <w:r>
+        <w:rPr/>
+        <w:t>Then we send a NMEA Group Function Command using the data listed above. A CAN Log image is shown below displaying command being sent.</w:t>
+        <w:br/>
+      </w:r>
+      <w:r>
+        <w:rPr/>
+        <w:drawing>
+          <wp:inline distT="0" distB="0" distL="0" distR="0">
+            <wp:extent cx="6201410" cy="193040"/>
+            <wp:effectExtent l="0" t="0" r="0" b="0"/>
+            <wp:docPr id="1" name="Picture 1"/>
+            <wp:cNvGraphicFramePr>
+              <a:graphicFrameLocks xmlns:a="http://schemas.openxmlformats.org/drawingml/2006/main" noChangeAspect="1"/>
+            </wp:cNvGraphicFramePr>
+            <a:graphic xmlns:a="http://schemas.openxmlformats.org/drawingml/2006/main">
+              <a:graphicData uri="http://schemas.openxmlformats.org/drawingml/2006/picture">
+                <pic:pic xmlns:pic="http://schemas.openxmlformats.org/drawingml/2006/picture">
+                  <pic:nvPicPr>
+                    <pic:cNvPr id="1" name="Picture 1"/>
+                    <pic:cNvPicPr>
+                      <a:picLocks noChangeAspect="1" noChangeArrowheads="1"/>
+                    </pic:cNvPicPr>
+                  </pic:nvPicPr>
+                  <pic:blipFill>
+                    <a:blip r:embed="rId3"/>
+                    <a:srcRect l="8509" t="12500" r="0" b="13372"/>
+                    <a:stretch>
+                      <a:fillRect/>
+                    </a:stretch>
+                  </pic:blipFill>
+                  <pic:spPr bwMode="auto">
+                    <a:xfrm>
+                      <a:off x="0" y="0"/>
+                      <a:ext cx="6201410" cy="193040"/>
+                    </a:xfrm>
+                    <a:prstGeom prst="rect">
+                      <a:avLst/>
+                    </a:prstGeom>
+                    <a:noFill/>
+                  </pic:spPr>
+                </pic:pic>
+              </a:graphicData>
+            </a:graphic>
+          </wp:inline>
+        </w:drawing>
+      </w:r>
+    </w:p>
+    <w:p>
+      <w:pPr>
+        <w:pStyle w:val="Caption"/>
+        <w:jc w:val="center"/>
+        <w:rPr/>
+      </w:pPr>
+      <w:r>
+        <w:rPr/>
+        <w:fldChar w:fldCharType="begin"/>
+      </w:r>
+      <w:r>
+        <w:rPr/>
+        <w:instrText xml:space="preserve"> SEQ Figure \* ARABIC </w:instrText>
+      </w:r>
+      <w:r>
+        <w:rPr/>
+        <w:fldChar w:fldCharType="separate"/>
+      </w:r>
+      <w:r>
+        <w:rPr/>
+        <w:t>1</w:t>
+      </w:r>
+      <w:r>
+        <w:rPr/>
+        <w:fldChar w:fldCharType="end"/>
+      </w:r>
+      <w:r>
+        <w:rPr/>
+        <w:t>- Full Message</w:t>
+      </w:r>
+    </w:p>
+    <w:p>
+      <w:pPr>
+        <w:pStyle w:val="Normal"/>
+        <w:keepNext w:val="true"/>
+        <w:rPr/>
+      </w:pPr>
+      <w:r>
+        <w:rPr/>
+        <w:drawing>
+          <wp:inline distT="0" distB="0" distL="0" distR="0">
+            <wp:extent cx="6192520" cy="441960"/>
+            <wp:effectExtent l="0" t="0" r="0" b="0"/>
+            <wp:docPr id="2" name="Image2"/>
+            <wp:cNvGraphicFramePr>
+              <a:graphicFrameLocks xmlns:a="http://schemas.openxmlformats.org/drawingml/2006/main" noChangeAspect="1"/>
+            </wp:cNvGraphicFramePr>
+            <a:graphic xmlns:a="http://schemas.openxmlformats.org/drawingml/2006/main">
+              <a:graphicData uri="http://schemas.openxmlformats.org/drawingml/2006/picture">
+                <pic:pic xmlns:pic="http://schemas.openxmlformats.org/drawingml/2006/picture">
+                  <pic:nvPicPr>
+                    <pic:cNvPr id="2" name="Image2"/>
+                    <pic:cNvPicPr>
+                      <a:picLocks noChangeAspect="1" noChangeArrowheads="1"/>
+                    </pic:cNvPicPr>
+                  </pic:nvPicPr>
+                  <pic:blipFill>
+                    <a:blip r:embed="rId4"/>
+                    <a:srcRect l="8680" t="0" r="0" b="0"/>
+                    <a:stretch>
+                      <a:fillRect/>
+                    </a:stretch>
+                  </pic:blipFill>
+                  <pic:spPr bwMode="auto">
+                    <a:xfrm>
+                      <a:off x="0" y="0"/>
+                      <a:ext cx="6192520" cy="441960"/>
+                    </a:xfrm>
+                    <a:prstGeom prst="rect">
+                      <a:avLst/>
+                    </a:prstGeom>
+                    <a:noFill/>
+                  </pic:spPr>
+                </pic:pic>
+              </a:graphicData>
+            </a:graphic>
+          </wp:inline>
+        </w:drawing>
+      </w:r>
+    </w:p>
+    <w:p>
+      <w:pPr>
+        <w:pStyle w:val="Caption"/>
+        <w:jc w:val="center"/>
+        <w:rPr/>
+      </w:pPr>
+      <w:r>
+        <w:rPr/>
+        <w:fldChar w:fldCharType="begin"/>
+      </w:r>
+      <w:r>
+        <w:rPr/>
+        <w:instrText xml:space="preserve"> SEQ Figure \* ARABIC </w:instrText>
+      </w:r>
+      <w:r>
+        <w:rPr/>
+        <w:fldChar w:fldCharType="separate"/>
+      </w:r>
+      <w:r>
+        <w:rPr/>
+        <w:t>2</w:t>
+      </w:r>
+      <w:r>
+        <w:rPr/>
+        <w:fldChar w:fldCharType="end"/>
+      </w:r>
+      <w:r>
+        <w:rPr/>
+        <w:t xml:space="preserve"> </w:t>
+      </w:r>
+      <w:r>
+        <w:rPr/>
+        <w:t>- Multi-Packet, ISO Transport Protocol Message</w:t>
+      </w:r>
+    </w:p>
+    <w:p>
+      <w:pPr>
+        <w:pStyle w:val="Normal"/>
+        <w:keepNext w:val="true"/>
+        <w:rPr/>
+      </w:pPr>
+      <w:r>
+        <w:rPr/>
+        <w:br/>
+        <w:t>Next, we request the PMAcInputCfgSts PGN using an ISO Request, and the response we receive is:</w:t>
+        <w:br/>
+      </w:r>
+      <w:r>
+        <w:rPr/>
+        <w:drawing>
+          <wp:inline distT="0" distB="0" distL="0" distR="0">
+            <wp:extent cx="6217920" cy="543560"/>
+            <wp:effectExtent l="0" t="0" r="0" b="0"/>
+            <wp:docPr id="3" name="Image3"/>
+            <wp:cNvGraphicFramePr>
+              <a:graphicFrameLocks xmlns:a="http://schemas.openxmlformats.org/drawingml/2006/main" noChangeAspect="1"/>
+            </wp:cNvGraphicFramePr>
+            <a:graphic xmlns:a="http://schemas.openxmlformats.org/drawingml/2006/main">
+              <a:graphicData uri="http://schemas.openxmlformats.org/drawingml/2006/picture">
+                <pic:pic xmlns:pic="http://schemas.openxmlformats.org/drawingml/2006/picture">
+                  <pic:nvPicPr>
+                    <pic:cNvPr id="3" name="Image3"/>
+                    <pic:cNvPicPr>
+                      <a:picLocks noChangeAspect="1" noChangeArrowheads="1"/>
+                    </pic:cNvPicPr>
+                  </pic:nvPicPr>
+                  <pic:blipFill>
+                    <a:blip r:embed="rId5"/>
+                    <a:srcRect l="9160" t="0" r="0" b="0"/>
+                    <a:stretch>
+                      <a:fillRect/>
+                    </a:stretch>
+                  </pic:blipFill>
+                  <pic:spPr bwMode="auto">
+                    <a:xfrm>
+                      <a:off x="0" y="0"/>
+                      <a:ext cx="6217920" cy="543560"/>
+                    </a:xfrm>
+                    <a:prstGeom prst="rect">
+                      <a:avLst/>
+                    </a:prstGeom>
+                    <a:noFill/>
+                  </pic:spPr>
+                </pic:pic>
+              </a:graphicData>
+            </a:graphic>
+          </wp:inline>
+        </w:drawing>
+      </w:r>
+    </w:p>
+    <w:p>
+      <w:pPr>
+        <w:pStyle w:val="Caption"/>
+        <w:jc w:val="center"/>
+        <w:rPr/>
+      </w:pPr>
+      <w:r>
+        <w:rPr/>
+        <w:fldChar w:fldCharType="begin"/>
+      </w:r>
+      <w:r>
+        <w:rPr/>
+        <w:instrText xml:space="preserve"> SEQ Figure \* ARABIC </w:instrText>
+      </w:r>
+      <w:r>
+        <w:rPr/>
+        <w:fldChar w:fldCharType="separate"/>
+      </w:r>
+      <w:r>
+        <w:rPr/>
+        <w:t>3</w:t>
+      </w:r>
+      <w:r>
+        <w:rPr/>
+        <w:fldChar w:fldCharType="end"/>
+      </w:r>
+      <w:r>
+        <w:rPr/>
+        <w:t xml:space="preserve"> – </w:t>
+      </w:r>
+      <w:r>
+        <w:rPr/>
+        <w:t>PMAcInputCfgSts</w:t>
+      </w:r>
+    </w:p>
+    <w:p>
+      <w:pPr>
+        <w:pStyle w:val="Normal"/>
+        <w:rPr/>
+      </w:pPr>
+      <w:r>
+        <w:rPr/>
+      </w:r>
+    </w:p>
+    <w:p>
+      <w:pPr>
+        <w:pStyle w:val="Normal"/>
+        <w:rPr/>
+      </w:pPr>
+      <w:r>
+        <w:rPr/>
+      </w:r>
+    </w:p>
+    <w:p>
+      <w:pPr>
+        <w:pStyle w:val="Normal"/>
+        <w:rPr/>
+      </w:pPr>
+      <w:r>
+        <w:rPr/>
+        <w:t>Decoding Message:</w:t>
+      </w:r>
+    </w:p>
+    <w:p>
+      <w:pPr>
+        <w:pStyle w:val="Normal"/>
+        <w:rPr/>
+      </w:pPr>
+      <w:r>
+        <w:rPr/>
+        <w:t>First 11 bits = Manufacture Code = 00010101000 = 168</w:t>
+        <w:br/>
+        <w:t>Next 2 bits = Reserved = 11</w:t>
+        <w:br/>
+        <w:t>Next 3 bits = Industry Group = 100 = 4</w:t>
+        <w:br/>
+        <w:t>Next 8 bits = AC Source Instance = 00000001 = 1</w:t>
+        <w:br/>
+        <w:t>Next 8 bits = Line Total = 00000001 = 1</w:t>
+        <w:br/>
+        <w:t>Next 2 bits = Line = 00 = 0</w:t>
+        <w:br/>
+        <w:t>Next 6 bits = Reserved = 111111</w:t>
+        <w:br/>
+        <w:t>Next 16 bits = Breaker Size = 0000000100101100 = 300, after scaling = 30A</w:t>
+        <w:br/>
+        <w:t>Next 16 bits = AC Lost Level = 0010100010100000 = 10400, after scaling = 104V</w:t>
+        <w:br/>
+        <w:t>For the rest of the fields, we do not support the data, hence the rest of all the data is FFh.</w:t>
+      </w:r>
+    </w:p>
+    <w:p>
+      <w:pPr>
+        <w:pStyle w:val="Normal"/>
+        <w:rPr/>
+      </w:pPr>
+      <w:r>
+        <w:rPr/>
+      </w:r>
+    </w:p>
+    <w:p>
+      <w:pPr>
+        <w:pStyle w:val="Heading2"/>
+        <w:rPr/>
+      </w:pPr>
+      <w:r>
+        <w:rPr/>
+        <w:t xml:space="preserve">PGN 127511 ( Inverter Configuration Status ) </w:t>
+      </w:r>
+    </w:p>
+    <w:p>
+      <w:pPr>
+        <w:pStyle w:val="Normal"/>
+        <w:rPr/>
+      </w:pPr>
+      <w:r>
+        <w:rPr/>
+        <w:t>To control the Inverting, the following data format is used:</w:t>
+      </w:r>
+    </w:p>
+    <w:p>
+      <w:pPr>
+        <w:pStyle w:val="Normal"/>
+        <w:rPr/>
+      </w:pPr>
+      <w:r>
+        <w:rPr/>
+        <w:t>Data: 01 17 F2 01 F8 04 01 01 02 02 03 01 04 XX</w:t>
+      </w:r>
+    </w:p>
+    <w:p>
+      <w:pPr>
+        <w:pStyle w:val="Normal"/>
+        <w:rPr/>
+      </w:pPr>
+      <w:r>
+        <w:rPr/>
+        <w:t>01 = Command Message</w:t>
+        <w:br/>
+        <w:t>17F201 = PGN ( 01F217 = 127511 )</w:t>
+        <w:br/>
+        <w:t xml:space="preserve">F8 = Priority ( 8 ) </w:t>
+        <w:br/>
+        <w:t>04 = Number of Pairs of Commanded Parameters To Follow ( 4 )</w:t>
+        <w:br/>
+        <w:t>01 = Field Num of First Param ( Inverter Instance )</w:t>
+        <w:br/>
+        <w:t>01 = Value of First Param ( 1 )</w:t>
+        <w:br/>
+        <w:t>02 = Field Num of Second Param ( AC Instance )</w:t>
+        <w:br/>
+        <w:t>02 = Value of Second Param ( 02 )</w:t>
+        <w:br/>
+        <w:t>03 = Field Num of Third Param ( DC Instance )</w:t>
+        <w:br/>
+        <w:t>01 = Value of Third Param ( 01 )</w:t>
+        <w:br/>
+        <w:t>04 = Field Num of Fourth Param ( Inverter Enable/Disable )</w:t>
+        <w:br/>
+        <w:t>XX = Value of Fourth Param ( 01 to Enable, 00 to Disable, 11 to leave unchanged )</w:t>
+      </w:r>
+    </w:p>
+    <w:p>
+      <w:pPr>
+        <w:pStyle w:val="Normal"/>
+        <w:rPr/>
+      </w:pPr>
+      <w:r>
+        <w:rPr/>
+        <w:t>Example of Enabling Inverting:</w:t>
+      </w:r>
+    </w:p>
+    <w:p>
+      <w:pPr>
+        <w:pStyle w:val="Normal"/>
+        <w:keepNext w:val="true"/>
+        <w:rPr/>
+      </w:pPr>
+      <w:r>
+        <w:rPr/>
+        <w:drawing>
+          <wp:inline distT="0" distB="0" distL="0" distR="0">
+            <wp:extent cx="6233160" cy="426720"/>
+            <wp:effectExtent l="0" t="0" r="0" b="0"/>
+            <wp:docPr id="4" name="Image4"/>
+            <wp:cNvGraphicFramePr>
+              <a:graphicFrameLocks xmlns:a="http://schemas.openxmlformats.org/drawingml/2006/main" noChangeAspect="1"/>
+            </wp:cNvGraphicFramePr>
+            <a:graphic xmlns:a="http://schemas.openxmlformats.org/drawingml/2006/main">
+              <a:graphicData uri="http://schemas.openxmlformats.org/drawingml/2006/picture">
+                <pic:pic xmlns:pic="http://schemas.openxmlformats.org/drawingml/2006/picture">
+                  <pic:nvPicPr>
+                    <pic:cNvPr id="4" name="Image4"/>
+                    <pic:cNvPicPr>
+                      <a:picLocks noChangeAspect="1" noChangeArrowheads="1"/>
+                    </pic:cNvPicPr>
+                  </pic:nvPicPr>
+                  <pic:blipFill>
+                    <a:blip r:embed="rId6"/>
+                    <a:srcRect l="8802" t="0" r="0" b="0"/>
+                    <a:stretch>
+                      <a:fillRect/>
+                    </a:stretch>
+                  </pic:blipFill>
+                  <pic:spPr bwMode="auto">
+                    <a:xfrm>
+                      <a:off x="0" y="0"/>
+                      <a:ext cx="6233160" cy="426720"/>
+                    </a:xfrm>
+                    <a:prstGeom prst="rect">
+                      <a:avLst/>
+                    </a:prstGeom>
+                    <a:noFill/>
+                  </pic:spPr>
+                </pic:pic>
+              </a:graphicData>
+            </a:graphic>
+          </wp:inline>
+        </w:drawing>
+      </w:r>
+    </w:p>
+    <w:p>
+      <w:pPr>
+        <w:pStyle w:val="Caption"/>
+        <w:jc w:val="center"/>
+        <w:rPr/>
+      </w:pPr>
+      <w:r>
+        <w:rPr/>
+        <w:fldChar w:fldCharType="begin"/>
+      </w:r>
+      <w:r>
+        <w:rPr/>
+        <w:instrText xml:space="preserve"> SEQ Figure \* ARABIC </w:instrText>
+      </w:r>
+      <w:r>
+        <w:rPr/>
+        <w:fldChar w:fldCharType="separate"/>
+      </w:r>
+      <w:r>
+        <w:rPr/>
+        <w:t>4</w:t>
+      </w:r>
+      <w:r>
+        <w:rPr/>
+        <w:fldChar w:fldCharType="end"/>
+      </w:r>
+      <w:r>
+        <w:rPr/>
+        <w:t xml:space="preserve"> </w:t>
+      </w:r>
+      <w:r>
+        <w:rPr/>
+        <w:t>- Enable Invert ( Multi-Packet &amp; Full Length )</w:t>
+      </w:r>
+    </w:p>
+    <w:p>
+      <w:pPr>
+        <w:pStyle w:val="Normal"/>
+        <w:rPr/>
+      </w:pPr>
+      <w:r>
+        <w:rPr/>
+      </w:r>
+    </w:p>
+    <w:p>
+      <w:pPr>
+        <w:pStyle w:val="Heading2"/>
+        <w:rPr>
+          <w:b w:val="false"/>
+          <w:bCs w:val="false"/>
+        </w:rPr>
+      </w:pPr>
+      <w:r>
+        <w:rPr/>
+        <w:t>PGN 65281 ( PM - FXCC Configuration Status )</w:t>
       </w:r>
     </w:p>
     <w:p>
@@ -320,18 +1004,13 @@
       <w:pPr>
         <w:pStyle w:val="Heading2"/>
         <w:rPr>
-          <w:b/>
-          <w:bCs/>
-          <w:color w:val="auto"/>
+          <w:b w:val="false"/>
+          <w:bCs w:val="false"/>
         </w:rPr>
       </w:pPr>
       <w:r>
-        <w:rPr>
-          <w:b/>
-          <w:bCs/>
-          <w:color w:val="auto"/>
-        </w:rPr>
-        <w:t>PGN 65280 ( Device Control Status )</w:t>
+        <w:rPr/>
+        <w:t>PGN 65280 ( PM - Device Control Status )</w:t>
       </w:r>
     </w:p>
     <w:p>
@@ -378,15 +1057,7 @@
       </w:pPr>
       <w:r>
         <w:rPr/>
-        <w:t>Data ( hex ): 01 0</w:t>
-      </w:r>
-      <w:r>
-        <w:rPr/>
-        <w:t>0</w:t>
-      </w:r>
-      <w:r>
-        <w:rPr/>
-        <w:t xml:space="preserve"> FF  00 08 03 01 A8 00 03 04 04 0X</w:t>
+        <w:t>Data ( hex ): 01 01 FF  00 08 03 01 A8 00 03 04 04 0X</w:t>
         <w:br/>
         <w:t>Valid values for X (decimal, convert to hex to use in data ): {0: 'Reboot',  4: 'Reset To Factory', 5: 'Reboot To Factory', 6: 'No Change'},</w:t>
       </w:r>
@@ -444,15 +1115,7 @@
       </w:pPr>
       <w:r>
         <w:rPr/>
-        <w:t>Data ( hex ): 01 0</w:t>
-      </w:r>
-      <w:r>
-        <w:rPr/>
-        <w:t>0</w:t>
-      </w:r>
-      <w:r>
-        <w:rPr/>
-        <w:t xml:space="preserve"> FF  00 08 03 01 A8 00 03 04 05 0X</w:t>
+        <w:t>Data ( hex ): 01 01 FF  00 08 03 01 A8 00 03 04 05 0X</w:t>
         <w:br/>
         <w:t>Valid values for X (decimal, convert to hex to use in data ): {0: 'Off', 1: 'On', 3: 'No Change'}</w:t>
       </w:r>
@@ -510,26 +1173,38 @@
       </w:pPr>
       <w:r>
         <w:rPr/>
-        <w:t>Data ( hex ): 01 0</w:t>
-      </w:r>
-      <w:r>
-        <w:rPr/>
-        <w:t>0</w:t>
-      </w:r>
-      <w:r>
-        <w:rPr/>
-        <w:t xml:space="preserve"> FF  00 08 03 01 A8 00 03 04 06 0X</w:t>
-        <w:br/>
-        <w:t>Valid values for X (decimal, convert to hex to use in data ): {0: 'APL', 1: 'PS', 3: 'Data Not Available'}</w:t>
-      </w:r>
-    </w:p>
-    <w:p>
-      <w:pPr>
-        <w:pStyle w:val="Normal"/>
-        <w:rPr/>
-      </w:pPr>
-      <w:r>
-        <w:rPr/>
+        <w:t>Data ( hex ): 01 01 FF  00 08 03 01 A8 00 03 04 06 0X</w:t>
+        <w:br/>
+        <w:t>Valid values for X (decimal, convert to hex to use in data ): {0: 'APL', 1: '</w:t>
+      </w:r>
+      <w:r>
+        <w:rPr/>
+        <w:t>U</w:t>
+      </w:r>
+      <w:r>
+        <w:rPr/>
+        <w:t>PS', 3: 'Data Not Available'}</w:t>
+      </w:r>
+    </w:p>
+    <w:p>
+      <w:pPr>
+        <w:pStyle w:val="Normal"/>
+        <w:rPr/>
+      </w:pPr>
+      <w:r>
+        <w:rPr/>
+      </w:r>
+    </w:p>
+    <w:p>
+      <w:pPr>
+        <w:pStyle w:val="Normal"/>
+        <w:rPr/>
+      </w:pPr>
+      <w:r>
+        <w:rPr/>
+      </w:r>
+      <w:r>
+        <w:br w:type="page"/>
       </w:r>
     </w:p>
     <w:p>
@@ -566,7 +1241,7 @@
       <w:pPr>
         <w:pStyle w:val="BodyText"/>
         <w:spacing w:lineRule="auto" w:line="278" w:before="0" w:after="159"/>
-        <w:ind w:hanging="0" w:left="0" w:right="0"/>
+        <w:ind w:hanging="0" w:start="0" w:end="0"/>
         <w:rPr/>
       </w:pPr>
       <w:r>
@@ -582,7 +1257,7 @@
       <w:pPr>
         <w:pStyle w:val="BodyText"/>
         <w:spacing w:lineRule="auto" w:line="278" w:before="0" w:after="159"/>
-        <w:ind w:hanging="0" w:left="0" w:right="0"/>
+        <w:ind w:hanging="0" w:start="0" w:end="0"/>
         <w:rPr/>
       </w:pPr>
       <w:r>
@@ -594,7 +1269,7 @@
       <w:pPr>
         <w:pStyle w:val="BodyText"/>
         <w:spacing w:lineRule="auto" w:line="278" w:before="0" w:after="159"/>
-        <w:ind w:hanging="0" w:left="0" w:right="0"/>
+        <w:ind w:hanging="0" w:start="0" w:end="0"/>
         <w:rPr/>
       </w:pPr>
       <w:r>
@@ -606,7 +1281,7 @@
       <w:pPr>
         <w:pStyle w:val="BodyText"/>
         <w:spacing w:lineRule="auto" w:line="278" w:before="0" w:after="159"/>
-        <w:ind w:hanging="0" w:left="0" w:right="0"/>
+        <w:ind w:hanging="0" w:start="0" w:end="0"/>
         <w:rPr/>
       </w:pPr>
       <w:r>
@@ -618,7 +1293,7 @@
       <w:pPr>
         <w:pStyle w:val="BodyText"/>
         <w:spacing w:lineRule="auto" w:line="278" w:before="0" w:after="159"/>
-        <w:ind w:hanging="0" w:left="0" w:right="0"/>
+        <w:ind w:hanging="0" w:start="0" w:end="0"/>
         <w:rPr/>
       </w:pPr>
       <w:r>
@@ -630,7 +1305,7 @@
       <w:pPr>
         <w:pStyle w:val="BodyText"/>
         <w:spacing w:lineRule="auto" w:line="278" w:before="0" w:after="159"/>
-        <w:ind w:hanging="0" w:left="0" w:right="0"/>
+        <w:ind w:hanging="0" w:start="0" w:end="0"/>
         <w:rPr/>
       </w:pPr>
       <w:r>
@@ -642,7 +1317,7 @@
       <w:pPr>
         <w:pStyle w:val="BodyText"/>
         <w:spacing w:lineRule="auto" w:line="278" w:before="0" w:after="159"/>
-        <w:ind w:hanging="0" w:left="0" w:right="0"/>
+        <w:ind w:hanging="0" w:start="0" w:end="0"/>
         <w:rPr/>
       </w:pPr>
       <w:r>
@@ -654,7 +1329,7 @@
       <w:pPr>
         <w:pStyle w:val="BodyText"/>
         <w:spacing w:lineRule="auto" w:line="278" w:before="0" w:after="159"/>
-        <w:ind w:hanging="0" w:left="0" w:right="0"/>
+        <w:ind w:hanging="0" w:start="0" w:end="0"/>
         <w:rPr/>
       </w:pPr>
       <w:r>
@@ -720,23 +1395,110 @@
       </w:pPr>
       <w:r>
         <w:rPr/>
-        <w:t xml:space="preserve">40 0D 01 01 FF 00 08 03 </w:t>
-      </w:r>
-    </w:p>
-    <w:p>
-      <w:pPr>
-        <w:pStyle w:val="Normal"/>
-        <w:rPr/>
-      </w:pPr>
-      <w:r>
-        <w:rPr/>
-        <w:t>41 01 A8 00 03 04 04 0X</w:t>
-      </w:r>
-    </w:p>
-    <w:p>
-      <w:pPr>
-        <w:pStyle w:val="Normal"/>
-        <w:spacing w:before="0" w:after="160"/>
+        <w:t>Assuming:</w:t>
+      </w:r>
+    </w:p>
+    <w:p>
+      <w:pPr>
+        <w:pStyle w:val="Normal"/>
+        <w:rPr/>
+      </w:pPr>
+      <w:r>
+        <w:rPr/>
+        <w:tab/>
+        <w:t>FXC CAN Address = 0x11</w:t>
+      </w:r>
+    </w:p>
+    <w:p>
+      <w:pPr>
+        <w:pStyle w:val="Normal"/>
+        <w:rPr/>
+      </w:pPr>
+      <w:r>
+        <w:rPr/>
+        <w:tab/>
+        <w:t>Source Address = 0x42</w:t>
+      </w:r>
+    </w:p>
+    <w:p>
+      <w:pPr>
+        <w:pStyle w:val="Normal"/>
+        <w:rPr/>
+      </w:pPr>
+      <w:r>
+        <w:rPr/>
+        <w:t>19ED</w:t>
+      </w:r>
+      <w:r>
+        <w:rPr/>
+        <w:t>1142:</w:t>
+      </w:r>
+      <w:r>
+        <w:rPr/>
+        <w:t xml:space="preserve">  40 0D 01 01 FF 00 08 03 </w:t>
+      </w:r>
+    </w:p>
+    <w:p>
+      <w:pPr>
+        <w:pStyle w:val="Normal"/>
+        <w:rPr/>
+      </w:pPr>
+      <w:r>
+        <w:rPr/>
+        <w:t>19ED</w:t>
+      </w:r>
+      <w:r>
+        <w:rPr/>
+        <w:t>1142:</w:t>
+      </w:r>
+      <w:r>
+        <w:rPr/>
+        <w:t xml:space="preserve">  41 01 A8 00 03 04 04 0X</w:t>
+      </w:r>
+    </w:p>
+    <w:p>
+      <w:pPr>
+        <w:pStyle w:val="Normal"/>
+        <w:rPr/>
+      </w:pPr>
+      <w:r>
+        <w:rPr/>
+      </w:r>
+    </w:p>
+    <w:p>
+      <w:pPr>
+        <w:pStyle w:val="Normal"/>
+        <w:rPr/>
+      </w:pPr>
+      <w:r>
+        <w:rPr/>
+      </w:r>
+    </w:p>
+    <w:p>
+      <w:pPr>
+        <w:pStyle w:val="Normal"/>
+        <w:rPr/>
+      </w:pPr>
+      <w:r>
+        <w:rPr/>
+      </w:r>
+    </w:p>
+    <w:p>
+      <w:pPr>
+        <w:pStyle w:val="Normal"/>
+        <w:rPr/>
+      </w:pPr>
+      <w:r>
+        <w:rPr/>
+      </w:r>
+    </w:p>
+    <w:p>
+      <w:pPr>
+        <w:pStyle w:val="Normal"/>
+        <w:widowControl/>
+        <w:bidi w:val="0"/>
+        <w:spacing w:lineRule="auto" w:line="278" w:before="0" w:after="160"/>
+        <w:jc w:val="start"/>
         <w:rPr/>
       </w:pPr>
       <w:r>
@@ -754,6 +1516,272 @@
     </w:sectPr>
   </w:body>
 </w:document>
+</file>
+
+<file path=word/numbering.xml><?xml version="1.0" encoding="utf-8"?>
+<w:numbering xmlns:w="http://schemas.openxmlformats.org/wordprocessingml/2006/main" xmlns:o="urn:schemas-microsoft-com:office:office" xmlns:r="http://schemas.openxmlformats.org/officeDocument/2006/relationships" xmlns:v="urn:schemas-microsoft-com:vml" xmlns:mc="http://schemas.openxmlformats.org/markup-compatibility/2006" xmlns:w14="http://schemas.microsoft.com/office/word/2010/wordml" mc:Ignorable="w14">
+  <w:abstractNum w:abstractNumId="1">
+    <w:lvl w:ilvl="0">
+      <w:numFmt w:val="bullet"/>
+      <w:lvlText w:val="-"/>
+      <w:lvlJc w:val="start"/>
+      <w:pPr>
+        <w:tabs>
+          <w:tab w:val="num" w:pos="0"/>
+        </w:tabs>
+        <w:ind w:start="720" w:hanging="360"/>
+      </w:pPr>
+      <w:rPr>
+        <w:rFonts w:ascii="Aptos" w:hAnsi="Aptos" w:cs="Aptos" w:hint="default"/>
+      </w:rPr>
+    </w:lvl>
+    <w:lvl w:ilvl="1">
+      <w:start w:val="1"/>
+      <w:numFmt w:val="bullet"/>
+      <w:lvlText w:val="o"/>
+      <w:lvlJc w:val="start"/>
+      <w:pPr>
+        <w:tabs>
+          <w:tab w:val="num" w:pos="0"/>
+        </w:tabs>
+        <w:ind w:start="1440" w:hanging="360"/>
+      </w:pPr>
+      <w:rPr>
+        <w:rFonts w:ascii="Courier New" w:hAnsi="Courier New" w:cs="Courier New" w:hint="default"/>
+      </w:rPr>
+    </w:lvl>
+    <w:lvl w:ilvl="2">
+      <w:start w:val="1"/>
+      <w:numFmt w:val="bullet"/>
+      <w:lvlText w:val=""/>
+      <w:lvlJc w:val="start"/>
+      <w:pPr>
+        <w:tabs>
+          <w:tab w:val="num" w:pos="0"/>
+        </w:tabs>
+        <w:ind w:start="2160" w:hanging="360"/>
+      </w:pPr>
+      <w:rPr>
+        <w:rFonts w:ascii="Wingdings" w:hAnsi="Wingdings" w:cs="Wingdings" w:hint="default"/>
+      </w:rPr>
+    </w:lvl>
+    <w:lvl w:ilvl="3">
+      <w:start w:val="1"/>
+      <w:numFmt w:val="bullet"/>
+      <w:lvlText w:val=""/>
+      <w:lvlJc w:val="start"/>
+      <w:pPr>
+        <w:tabs>
+          <w:tab w:val="num" w:pos="0"/>
+        </w:tabs>
+        <w:ind w:start="2880" w:hanging="360"/>
+      </w:pPr>
+      <w:rPr>
+        <w:rFonts w:ascii="Symbol" w:hAnsi="Symbol" w:cs="Symbol" w:hint="default"/>
+      </w:rPr>
+    </w:lvl>
+    <w:lvl w:ilvl="4">
+      <w:start w:val="1"/>
+      <w:numFmt w:val="bullet"/>
+      <w:lvlText w:val="o"/>
+      <w:lvlJc w:val="start"/>
+      <w:pPr>
+        <w:tabs>
+          <w:tab w:val="num" w:pos="0"/>
+        </w:tabs>
+        <w:ind w:start="3600" w:hanging="360"/>
+      </w:pPr>
+      <w:rPr>
+        <w:rFonts w:ascii="Courier New" w:hAnsi="Courier New" w:cs="Courier New" w:hint="default"/>
+      </w:rPr>
+    </w:lvl>
+    <w:lvl w:ilvl="5">
+      <w:start w:val="1"/>
+      <w:numFmt w:val="bullet"/>
+      <w:lvlText w:val=""/>
+      <w:lvlJc w:val="start"/>
+      <w:pPr>
+        <w:tabs>
+          <w:tab w:val="num" w:pos="0"/>
+        </w:tabs>
+        <w:ind w:start="4320" w:hanging="360"/>
+      </w:pPr>
+      <w:rPr>
+        <w:rFonts w:ascii="Wingdings" w:hAnsi="Wingdings" w:cs="Wingdings" w:hint="default"/>
+      </w:rPr>
+    </w:lvl>
+    <w:lvl w:ilvl="6">
+      <w:start w:val="1"/>
+      <w:numFmt w:val="bullet"/>
+      <w:lvlText w:val=""/>
+      <w:lvlJc w:val="start"/>
+      <w:pPr>
+        <w:tabs>
+          <w:tab w:val="num" w:pos="0"/>
+        </w:tabs>
+        <w:ind w:start="5040" w:hanging="360"/>
+      </w:pPr>
+      <w:rPr>
+        <w:rFonts w:ascii="Symbol" w:hAnsi="Symbol" w:cs="Symbol" w:hint="default"/>
+      </w:rPr>
+    </w:lvl>
+    <w:lvl w:ilvl="7">
+      <w:start w:val="1"/>
+      <w:numFmt w:val="bullet"/>
+      <w:lvlText w:val="o"/>
+      <w:lvlJc w:val="start"/>
+      <w:pPr>
+        <w:tabs>
+          <w:tab w:val="num" w:pos="0"/>
+        </w:tabs>
+        <w:ind w:start="5760" w:hanging="360"/>
+      </w:pPr>
+      <w:rPr>
+        <w:rFonts w:ascii="Courier New" w:hAnsi="Courier New" w:cs="Courier New" w:hint="default"/>
+      </w:rPr>
+    </w:lvl>
+    <w:lvl w:ilvl="8">
+      <w:start w:val="1"/>
+      <w:numFmt w:val="bullet"/>
+      <w:lvlText w:val=""/>
+      <w:lvlJc w:val="start"/>
+      <w:pPr>
+        <w:tabs>
+          <w:tab w:val="num" w:pos="0"/>
+        </w:tabs>
+        <w:ind w:start="6480" w:hanging="360"/>
+      </w:pPr>
+      <w:rPr>
+        <w:rFonts w:ascii="Wingdings" w:hAnsi="Wingdings" w:cs="Wingdings" w:hint="default"/>
+      </w:rPr>
+    </w:lvl>
+  </w:abstractNum>
+  <w:abstractNum w:abstractNumId="2">
+    <w:lvl w:ilvl="0">
+      <w:start w:val="1"/>
+      <w:numFmt w:val="none"/>
+      <w:suff w:val="nothing"/>
+      <w:lvlText w:val=""/>
+      <w:lvlJc w:val="start"/>
+      <w:pPr>
+        <w:tabs>
+          <w:tab w:val="num" w:pos="0"/>
+        </w:tabs>
+        <w:ind w:start="0" w:hanging="0"/>
+      </w:pPr>
+    </w:lvl>
+    <w:lvl w:ilvl="1">
+      <w:start w:val="1"/>
+      <w:numFmt w:val="none"/>
+      <w:suff w:val="nothing"/>
+      <w:lvlText w:val=""/>
+      <w:lvlJc w:val="start"/>
+      <w:pPr>
+        <w:tabs>
+          <w:tab w:val="num" w:pos="0"/>
+        </w:tabs>
+        <w:ind w:start="0" w:hanging="0"/>
+      </w:pPr>
+    </w:lvl>
+    <w:lvl w:ilvl="2">
+      <w:start w:val="1"/>
+      <w:numFmt w:val="none"/>
+      <w:suff w:val="nothing"/>
+      <w:lvlText w:val=""/>
+      <w:lvlJc w:val="start"/>
+      <w:pPr>
+        <w:tabs>
+          <w:tab w:val="num" w:pos="0"/>
+        </w:tabs>
+        <w:ind w:start="0" w:hanging="0"/>
+      </w:pPr>
+    </w:lvl>
+    <w:lvl w:ilvl="3">
+      <w:start w:val="1"/>
+      <w:numFmt w:val="none"/>
+      <w:suff w:val="nothing"/>
+      <w:lvlText w:val=""/>
+      <w:lvlJc w:val="start"/>
+      <w:pPr>
+        <w:tabs>
+          <w:tab w:val="num" w:pos="0"/>
+        </w:tabs>
+        <w:ind w:start="0" w:hanging="0"/>
+      </w:pPr>
+    </w:lvl>
+    <w:lvl w:ilvl="4">
+      <w:start w:val="1"/>
+      <w:numFmt w:val="none"/>
+      <w:suff w:val="nothing"/>
+      <w:lvlText w:val=""/>
+      <w:lvlJc w:val="start"/>
+      <w:pPr>
+        <w:tabs>
+          <w:tab w:val="num" w:pos="0"/>
+        </w:tabs>
+        <w:ind w:start="0" w:hanging="0"/>
+      </w:pPr>
+    </w:lvl>
+    <w:lvl w:ilvl="5">
+      <w:start w:val="1"/>
+      <w:numFmt w:val="none"/>
+      <w:suff w:val="nothing"/>
+      <w:lvlText w:val=""/>
+      <w:lvlJc w:val="start"/>
+      <w:pPr>
+        <w:tabs>
+          <w:tab w:val="num" w:pos="0"/>
+        </w:tabs>
+        <w:ind w:start="0" w:hanging="0"/>
+      </w:pPr>
+    </w:lvl>
+    <w:lvl w:ilvl="6">
+      <w:start w:val="1"/>
+      <w:numFmt w:val="none"/>
+      <w:suff w:val="nothing"/>
+      <w:lvlText w:val=""/>
+      <w:lvlJc w:val="start"/>
+      <w:pPr>
+        <w:tabs>
+          <w:tab w:val="num" w:pos="0"/>
+        </w:tabs>
+        <w:ind w:start="0" w:hanging="0"/>
+      </w:pPr>
+    </w:lvl>
+    <w:lvl w:ilvl="7">
+      <w:start w:val="1"/>
+      <w:numFmt w:val="none"/>
+      <w:suff w:val="nothing"/>
+      <w:lvlText w:val=""/>
+      <w:lvlJc w:val="start"/>
+      <w:pPr>
+        <w:tabs>
+          <w:tab w:val="num" w:pos="0"/>
+        </w:tabs>
+        <w:ind w:start="0" w:hanging="0"/>
+      </w:pPr>
+    </w:lvl>
+    <w:lvl w:ilvl="8">
+      <w:start w:val="1"/>
+      <w:numFmt w:val="none"/>
+      <w:suff w:val="nothing"/>
+      <w:lvlText w:val=""/>
+      <w:lvlJc w:val="start"/>
+      <w:pPr>
+        <w:tabs>
+          <w:tab w:val="num" w:pos="0"/>
+        </w:tabs>
+        <w:ind w:start="0" w:hanging="0"/>
+      </w:pPr>
+    </w:lvl>
+  </w:abstractNum>
+  <w:num w:numId="1">
+    <w:abstractNumId w:val="1"/>
+  </w:num>
+  <w:num w:numId="2">
+    <w:abstractNumId w:val="2"/>
+  </w:num>
+</w:numbering>
 </file>
 
 <file path=word/styles.xml><?xml version="1.0" encoding="utf-8"?>
@@ -1160,7 +2188,7 @@
       <w:widowControl/>
       <w:bidi w:val="0"/>
       <w:spacing w:lineRule="auto" w:line="278" w:before="0" w:after="160"/>
-      <w:jc w:val="left"/>
+      <w:jc w:val="start"/>
     </w:pPr>
     <w:rPr>
       <w:rFonts w:ascii="Aptos" w:hAnsi="Aptos" w:eastAsia="Aptos" w:cs="" w:asciiTheme="minorHAnsi" w:cstheme="minorBidi" w:eastAsiaTheme="minorHAnsi" w:hAnsiTheme="minorHAnsi"/>
@@ -1187,7 +2215,7 @@
       <w:outlineLvl w:val="0"/>
     </w:pPr>
     <w:rPr>
-      <w:rFonts w:ascii="Aptos Display" w:hAnsi="Aptos Display" w:eastAsia="等线 Light" w:cs="" w:asciiTheme="majorHAnsi" w:cstheme="majorBidi" w:eastAsiaTheme="majorEastAsia" w:hAnsiTheme="majorHAnsi"/>
+      <w:rFonts w:ascii="Aptos Display" w:hAnsi="Aptos Display" w:eastAsia="" w:cs="" w:asciiTheme="majorHAnsi" w:cstheme="majorBidi" w:eastAsiaTheme="majorEastAsia" w:hAnsiTheme="majorHAnsi"/>
       <w:color w:themeColor="accent1" w:themeShade="bf" w:val="0F4761"/>
       <w:sz w:val="40"/>
       <w:szCs w:val="40"/>
@@ -1201,7 +2229,7 @@
     <w:uiPriority w:val="9"/>
     <w:unhideWhenUsed/>
     <w:qFormat/>
-    <w:rsid w:val="00f50f68"/>
+    <w:rsid w:val="00a46a89"/>
     <w:pPr>
       <w:keepNext w:val="true"/>
       <w:keepLines/>
@@ -1209,8 +2237,9 @@
       <w:outlineLvl w:val="1"/>
     </w:pPr>
     <w:rPr>
-      <w:rFonts w:ascii="Aptos Display" w:hAnsi="Aptos Display" w:eastAsia="等线 Light" w:cs="" w:asciiTheme="majorHAnsi" w:cstheme="majorBidi" w:eastAsiaTheme="majorEastAsia" w:hAnsiTheme="majorHAnsi"/>
-      <w:color w:themeColor="accent1" w:themeShade="bf" w:val="0F4761"/>
+      <w:rFonts w:ascii="Aptos Display" w:hAnsi="Aptos Display" w:eastAsia="" w:cs="" w:asciiTheme="majorHAnsi" w:cstheme="majorBidi" w:eastAsiaTheme="majorEastAsia" w:hAnsiTheme="majorHAnsi"/>
+      <w:b/>
+      <w:bCs/>
       <w:sz w:val="32"/>
       <w:szCs w:val="32"/>
     </w:rPr>
@@ -1232,7 +2261,7 @@
       <w:outlineLvl w:val="2"/>
     </w:pPr>
     <w:rPr>
-      <w:rFonts w:eastAsia="等线 Light" w:cs="" w:cstheme="majorBidi" w:eastAsiaTheme="majorEastAsia"/>
+      <w:rFonts w:eastAsia="" w:cs="" w:cstheme="majorBidi" w:eastAsiaTheme="majorEastAsia"/>
       <w:color w:themeColor="accent1" w:themeShade="bf" w:val="0F4761"/>
       <w:sz w:val="28"/>
       <w:szCs w:val="28"/>
@@ -1255,7 +2284,7 @@
       <w:outlineLvl w:val="3"/>
     </w:pPr>
     <w:rPr>
-      <w:rFonts w:eastAsia="等线 Light" w:cs="" w:cstheme="majorBidi" w:eastAsiaTheme="majorEastAsia"/>
+      <w:rFonts w:eastAsia="" w:cs="" w:cstheme="majorBidi" w:eastAsiaTheme="majorEastAsia"/>
       <w:i/>
       <w:iCs/>
       <w:color w:themeColor="accent1" w:themeShade="bf" w:val="0F4761"/>
@@ -1278,7 +2307,7 @@
       <w:outlineLvl w:val="4"/>
     </w:pPr>
     <w:rPr>
-      <w:rFonts w:eastAsia="等线 Light" w:cs="" w:cstheme="majorBidi" w:eastAsiaTheme="majorEastAsia"/>
+      <w:rFonts w:eastAsia="" w:cs="" w:cstheme="majorBidi" w:eastAsiaTheme="majorEastAsia"/>
       <w:color w:themeColor="accent1" w:themeShade="bf" w:val="0F4761"/>
     </w:rPr>
   </w:style>
@@ -1299,7 +2328,7 @@
       <w:outlineLvl w:val="5"/>
     </w:pPr>
     <w:rPr>
-      <w:rFonts w:eastAsia="等线 Light" w:cs="" w:cstheme="majorBidi" w:eastAsiaTheme="majorEastAsia"/>
+      <w:rFonts w:eastAsia="" w:cs="" w:cstheme="majorBidi" w:eastAsiaTheme="majorEastAsia"/>
       <w:i/>
       <w:iCs/>
       <w:color w:themeColor="text1" w:themeTint="a6" w:val="595959"/>
@@ -1322,7 +2351,7 @@
       <w:outlineLvl w:val="6"/>
     </w:pPr>
     <w:rPr>
-      <w:rFonts w:eastAsia="等线 Light" w:cs="" w:cstheme="majorBidi" w:eastAsiaTheme="majorEastAsia"/>
+      <w:rFonts w:eastAsia="" w:cs="" w:cstheme="majorBidi" w:eastAsiaTheme="majorEastAsia"/>
       <w:color w:themeColor="text1" w:themeTint="a6" w:val="595959"/>
     </w:rPr>
   </w:style>
@@ -1343,7 +2372,7 @@
       <w:outlineLvl w:val="7"/>
     </w:pPr>
     <w:rPr>
-      <w:rFonts w:eastAsia="等线 Light" w:cs="" w:cstheme="majorBidi" w:eastAsiaTheme="majorEastAsia"/>
+      <w:rFonts w:eastAsia="" w:cs="" w:cstheme="majorBidi" w:eastAsiaTheme="majorEastAsia"/>
       <w:i/>
       <w:iCs/>
       <w:color w:themeColor="text1" w:themeTint="d8" w:val="272727"/>
@@ -1366,13 +2395,14 @@
       <w:outlineLvl w:val="8"/>
     </w:pPr>
     <w:rPr>
-      <w:rFonts w:eastAsia="等线 Light" w:cs="" w:cstheme="majorBidi" w:eastAsiaTheme="majorEastAsia"/>
+      <w:rFonts w:eastAsia="" w:cs="" w:cstheme="majorBidi" w:eastAsiaTheme="majorEastAsia"/>
       <w:color w:themeColor="text1" w:themeTint="d8" w:val="272727"/>
     </w:rPr>
   </w:style>
   <w:style w:type="character" w:styleId="DefaultParagraphFont" w:default="1">
     <w:name w:val="Default Paragraph Font"/>
     <w:uiPriority w:val="1"/>
+    <w:semiHidden/>
     <w:unhideWhenUsed/>
     <w:qFormat/>
     <w:rPr/>
@@ -1385,7 +2415,7 @@
     <w:qFormat/>
     <w:rsid w:val="00f50f68"/>
     <w:rPr>
-      <w:rFonts w:ascii="Aptos Display" w:hAnsi="Aptos Display" w:eastAsia="等线 Light" w:cs="" w:asciiTheme="majorHAnsi" w:cstheme="majorBidi" w:eastAsiaTheme="majorEastAsia" w:hAnsiTheme="majorHAnsi"/>
+      <w:rFonts w:ascii="Aptos Display" w:hAnsi="Aptos Display" w:eastAsia="" w:cs="" w:asciiTheme="majorHAnsi" w:cstheme="majorBidi" w:eastAsiaTheme="majorEastAsia" w:hAnsiTheme="majorHAnsi"/>
       <w:color w:themeColor="accent1" w:themeShade="bf" w:val="0F4761"/>
       <w:sz w:val="40"/>
       <w:szCs w:val="40"/>
@@ -1397,10 +2427,11 @@
     <w:link w:val="Heading2"/>
     <w:uiPriority w:val="9"/>
     <w:qFormat/>
-    <w:rsid w:val="00f50f68"/>
-    <w:rPr>
-      <w:rFonts w:ascii="Aptos Display" w:hAnsi="Aptos Display" w:eastAsia="等线 Light" w:cs="" w:asciiTheme="majorHAnsi" w:cstheme="majorBidi" w:eastAsiaTheme="majorEastAsia" w:hAnsiTheme="majorHAnsi"/>
-      <w:color w:themeColor="accent1" w:themeShade="bf" w:val="0F4761"/>
+    <w:rsid w:val="00a46a89"/>
+    <w:rPr>
+      <w:rFonts w:ascii="Aptos Display" w:hAnsi="Aptos Display" w:eastAsia="" w:cs="" w:asciiTheme="majorHAnsi" w:cstheme="majorBidi" w:eastAsiaTheme="majorEastAsia" w:hAnsiTheme="majorHAnsi"/>
+      <w:b/>
+      <w:bCs/>
       <w:sz w:val="32"/>
       <w:szCs w:val="32"/>
     </w:rPr>
@@ -1414,7 +2445,7 @@
     <w:qFormat/>
     <w:rsid w:val="00f50f68"/>
     <w:rPr>
-      <w:rFonts w:eastAsia="等线 Light" w:cs="" w:cstheme="majorBidi" w:eastAsiaTheme="majorEastAsia"/>
+      <w:rFonts w:eastAsia="" w:cs="" w:cstheme="majorBidi" w:eastAsiaTheme="majorEastAsia"/>
       <w:color w:themeColor="accent1" w:themeShade="bf" w:val="0F4761"/>
       <w:sz w:val="28"/>
       <w:szCs w:val="28"/>
@@ -1429,7 +2460,7 @@
     <w:qFormat/>
     <w:rsid w:val="00f50f68"/>
     <w:rPr>
-      <w:rFonts w:eastAsia="等线 Light" w:cs="" w:cstheme="majorBidi" w:eastAsiaTheme="majorEastAsia"/>
+      <w:rFonts w:eastAsia="" w:cs="" w:cstheme="majorBidi" w:eastAsiaTheme="majorEastAsia"/>
       <w:i/>
       <w:iCs/>
       <w:color w:themeColor="accent1" w:themeShade="bf" w:val="0F4761"/>
@@ -1444,7 +2475,7 @@
     <w:qFormat/>
     <w:rsid w:val="00f50f68"/>
     <w:rPr>
-      <w:rFonts w:eastAsia="等线 Light" w:cs="" w:cstheme="majorBidi" w:eastAsiaTheme="majorEastAsia"/>
+      <w:rFonts w:eastAsia="" w:cs="" w:cstheme="majorBidi" w:eastAsiaTheme="majorEastAsia"/>
       <w:color w:themeColor="accent1" w:themeShade="bf" w:val="0F4761"/>
     </w:rPr>
   </w:style>
@@ -1457,7 +2488,7 @@
     <w:qFormat/>
     <w:rsid w:val="00f50f68"/>
     <w:rPr>
-      <w:rFonts w:eastAsia="等线 Light" w:cs="" w:cstheme="majorBidi" w:eastAsiaTheme="majorEastAsia"/>
+      <w:rFonts w:eastAsia="" w:cs="" w:cstheme="majorBidi" w:eastAsiaTheme="majorEastAsia"/>
       <w:i/>
       <w:iCs/>
       <w:color w:themeColor="text1" w:themeTint="a6" w:val="595959"/>
@@ -1472,7 +2503,7 @@
     <w:qFormat/>
     <w:rsid w:val="00f50f68"/>
     <w:rPr>
-      <w:rFonts w:eastAsia="等线 Light" w:cs="" w:cstheme="majorBidi" w:eastAsiaTheme="majorEastAsia"/>
+      <w:rFonts w:eastAsia="" w:cs="" w:cstheme="majorBidi" w:eastAsiaTheme="majorEastAsia"/>
       <w:color w:themeColor="text1" w:themeTint="a6" w:val="595959"/>
     </w:rPr>
   </w:style>
@@ -1485,7 +2516,7 @@
     <w:qFormat/>
     <w:rsid w:val="00f50f68"/>
     <w:rPr>
-      <w:rFonts w:eastAsia="等线 Light" w:cs="" w:cstheme="majorBidi" w:eastAsiaTheme="majorEastAsia"/>
+      <w:rFonts w:eastAsia="" w:cs="" w:cstheme="majorBidi" w:eastAsiaTheme="majorEastAsia"/>
       <w:i/>
       <w:iCs/>
       <w:color w:themeColor="text1" w:themeTint="d8" w:val="272727"/>
@@ -1500,7 +2531,7 @@
     <w:qFormat/>
     <w:rsid w:val="00f50f68"/>
     <w:rPr>
-      <w:rFonts w:eastAsia="等线 Light" w:cs="" w:cstheme="majorBidi" w:eastAsiaTheme="majorEastAsia"/>
+      <w:rFonts w:eastAsia="" w:cs="" w:cstheme="majorBidi" w:eastAsiaTheme="majorEastAsia"/>
       <w:color w:themeColor="text1" w:themeTint="d8" w:val="272727"/>
     </w:rPr>
   </w:style>
@@ -1512,7 +2543,7 @@
     <w:qFormat/>
     <w:rsid w:val="00f50f68"/>
     <w:rPr>
-      <w:rFonts w:ascii="Aptos Display" w:hAnsi="Aptos Display" w:eastAsia="等线 Light" w:cs="" w:asciiTheme="majorHAnsi" w:cstheme="majorBidi" w:eastAsiaTheme="majorEastAsia" w:hAnsiTheme="majorHAnsi"/>
+      <w:rFonts w:ascii="Aptos Display" w:hAnsi="Aptos Display" w:eastAsia="" w:cs="" w:asciiTheme="majorHAnsi" w:cstheme="majorBidi" w:eastAsiaTheme="majorEastAsia" w:hAnsiTheme="majorHAnsi"/>
       <w:spacing w:val="-10"/>
       <w:kern w:val="2"/>
       <w:sz w:val="56"/>
@@ -1527,7 +2558,7 @@
     <w:qFormat/>
     <w:rsid w:val="00f50f68"/>
     <w:rPr>
-      <w:rFonts w:eastAsia="等线 Light" w:cs="" w:cstheme="majorBidi" w:eastAsiaTheme="majorEastAsia"/>
+      <w:rFonts w:eastAsia="" w:cs="" w:cstheme="majorBidi" w:eastAsiaTheme="majorEastAsia"/>
       <w:color w:themeColor="text1" w:themeTint="a6" w:val="595959"/>
       <w:spacing w:val="15"/>
       <w:sz w:val="28"/>
@@ -1584,6 +2615,18 @@
       <w:smallCaps/>
       <w:color w:themeColor="accent1" w:themeShade="bf" w:val="0F4761"/>
       <w:spacing w:val="5"/>
+    </w:rPr>
+  </w:style>
+  <w:style w:type="character" w:styleId="SubtleEmphasis">
+    <w:name w:val="Subtle Emphasis"/>
+    <w:basedOn w:val="DefaultParagraphFont"/>
+    <w:uiPriority w:val="19"/>
+    <w:qFormat/>
+    <w:rsid w:val="00e27cfd"/>
+    <w:rPr>
+      <w:i/>
+      <w:iCs/>
+      <w:color w:themeColor="text1" w:themeTint="bf" w:val="404040"/>
     </w:rPr>
   </w:style>
   <w:style w:type="character" w:styleId="Hyperlink">
@@ -1627,17 +2670,20 @@
   <w:style w:type="paragraph" w:styleId="Caption">
     <w:name w:val="caption"/>
     <w:basedOn w:val="Normal"/>
-    <w:qFormat/>
+    <w:next w:val="Normal"/>
+    <w:uiPriority w:val="35"/>
+    <w:unhideWhenUsed/>
+    <w:qFormat/>
+    <w:rsid w:val="00831cde"/>
     <w:pPr>
-      <w:suppressLineNumbers/>
-      <w:spacing w:before="120" w:after="120"/>
+      <w:spacing w:lineRule="auto" w:line="240" w:before="0" w:after="200"/>
     </w:pPr>
     <w:rPr>
-      <w:rFonts w:cs="Arial"/>
       <w:i/>
       <w:iCs/>
-      <w:sz w:val="24"/>
-      <w:szCs w:val="24"/>
+      <w:color w:themeColor="text2" w:val="0E2841"/>
+      <w:sz w:val="18"/>
+      <w:szCs w:val="18"/>
     </w:rPr>
   </w:style>
   <w:style w:type="paragraph" w:styleId="Index">
@@ -1664,7 +2710,7 @@
       <w:contextualSpacing/>
     </w:pPr>
     <w:rPr>
-      <w:rFonts w:ascii="Aptos Display" w:hAnsi="Aptos Display" w:eastAsia="等线 Light" w:cs="" w:asciiTheme="majorHAnsi" w:cstheme="majorBidi" w:eastAsiaTheme="majorEastAsia" w:hAnsiTheme="majorHAnsi"/>
+      <w:rFonts w:ascii="Aptos Display" w:hAnsi="Aptos Display" w:eastAsia="" w:cs="" w:asciiTheme="majorHAnsi" w:cstheme="majorBidi" w:eastAsiaTheme="majorEastAsia" w:hAnsiTheme="majorHAnsi"/>
       <w:spacing w:val="-10"/>
       <w:kern w:val="2"/>
       <w:sz w:val="56"/>
@@ -1681,7 +2727,7 @@
     <w:rsid w:val="00f50f68"/>
     <w:pPr/>
     <w:rPr>
-      <w:rFonts w:eastAsia="等线 Light" w:cs="" w:cstheme="majorBidi" w:eastAsiaTheme="majorEastAsia"/>
+      <w:rFonts w:eastAsia="" w:cs="" w:cstheme="majorBidi" w:eastAsiaTheme="majorEastAsia"/>
       <w:color w:themeColor="text1" w:themeTint="a6" w:val="595959"/>
       <w:spacing w:val="15"/>
       <w:sz w:val="28"/>
@@ -1714,7 +2760,7 @@
     <w:rsid w:val="00f50f68"/>
     <w:pPr>
       <w:spacing w:before="0" w:after="160"/>
-      <w:ind w:left="720"/>
+      <w:ind w:start="720"/>
       <w:contextualSpacing/>
     </w:pPr>
     <w:rPr/>
@@ -1733,7 +2779,7 @@
         <w:bottom w:val="single" w:sz="4" w:space="10" w:color="0F4761" w:themeColor="accent1" w:themeShade="bf"/>
       </w:pBdr>
       <w:spacing w:before="360" w:after="360"/>
-      <w:ind w:left="864" w:right="864"/>
+      <w:ind w:start="864" w:end="864"/>
       <w:jc w:val="center"/>
     </w:pPr>
     <w:rPr>
@@ -1774,37 +2820,37 @@
         <a:srgbClr val="000000"/>
       </a:dk1>
       <a:lt1>
-        <a:srgbClr val="ffffff"/>
+        <a:srgbClr val="FFFFFF"/>
       </a:lt1>
       <a:dk2>
-        <a:srgbClr val="0e2841"/>
+        <a:srgbClr val="0E2841"/>
       </a:dk2>
       <a:lt2>
-        <a:srgbClr val="e8e8e8"/>
+        <a:srgbClr val="E8E8E8"/>
       </a:lt2>
       <a:accent1>
         <a:srgbClr val="156082"/>
       </a:accent1>
       <a:accent2>
-        <a:srgbClr val="e97132"/>
+        <a:srgbClr val="E97132"/>
       </a:accent2>
       <a:accent3>
-        <a:srgbClr val="196b24"/>
+        <a:srgbClr val="196B24"/>
       </a:accent3>
       <a:accent4>
-        <a:srgbClr val="0f9ed5"/>
+        <a:srgbClr val="0F9ED5"/>
       </a:accent4>
       <a:accent5>
-        <a:srgbClr val="a02b93"/>
+        <a:srgbClr val="A02B93"/>
       </a:accent5>
       <a:accent6>
-        <a:srgbClr val="4ea72e"/>
+        <a:srgbClr val="4EA72E"/>
       </a:accent6>
       <a:hlink>
         <a:srgbClr val="467886"/>
       </a:hlink>
       <a:folHlink>
-        <a:srgbClr val="96607d"/>
+        <a:srgbClr val="96607D"/>
       </a:folHlink>
     </a:clrScheme>
     <a:fontScheme name="Office">

</xml_diff>